<commit_message>
docs: Add detailed menu guide document.
</commit_message>
<xml_diff>
--- a/public/huongdan/thucdonchitiet.docx
+++ b/public/huongdan/thucdonchitiet.docx
@@ -4,10 +4,43 @@
   <w:body>
     <w:p>
       <w:pPr>
+        <w:rPr>
+          <w:b/>
+          <w:sz w:val="60"/>
+          <w:szCs w:val="60"/>
+        </w:rPr>
+      </w:pPr>
+      <w:r>
+        <w:rPr>
+          <w:rFonts w:ascii="Nunito Fallback" w:hAnsi="Nunito Fallback"/>
+          <w:b/>
+          <w:color w:val="1E293B"/>
+          <w:sz w:val="60"/>
+          <w:szCs w:val="60"/>
+          <w:shd w:val="clear" w:color="auto" w:fill="FFFFFF"/>
+        </w:rPr>
+        <w:t>Chi phí ăn bán trú là 17</w:t>
+      </w:r>
+      <w:bookmarkStart w:id="0" w:name="_GoBack"/>
+      <w:bookmarkEnd w:id="0"/>
+      <w:r>
+        <w:rPr>
+          <w:rFonts w:ascii="Nunito Fallback" w:hAnsi="Nunito Fallback"/>
+          <w:b/>
+          <w:color w:val="1E293B"/>
+          <w:sz w:val="60"/>
+          <w:szCs w:val="60"/>
+          <w:shd w:val="clear" w:color="auto" w:fill="FFFFFF"/>
+        </w:rPr>
+        <w:t>.000 đồng/ngày/trẻ</w:t>
+      </w:r>
+    </w:p>
+    <w:p>
+      <w:pPr>
         <w:spacing w:before="100" w:beforeAutospacing="1" w:after="100" w:afterAutospacing="1" w:line="240" w:lineRule="auto"/>
         <w:outlineLvl w:val="0"/>
         <w:rPr>
-          <w:rFonts w:eastAsia="Times New Roman" w:cs="Times New Roman"/>
+          <w:rFonts w:ascii="Cambria" w:eastAsia="Times New Roman" w:hAnsi="Cambria" w:cs="Cambria"/>
           <w:b/>
           <w:bCs/>
           <w:kern w:val="36"/>
@@ -15,28 +48,56 @@
           <w:szCs w:val="48"/>
         </w:rPr>
       </w:pPr>
-      <w:r>
-        <w:rPr>
-          <w:rFonts w:ascii="Cambria" w:eastAsia="Times New Roman" w:hAnsi="Cambria" w:cs="Cambria"/>
+    </w:p>
+    <w:p>
+      <w:pPr>
+        <w:spacing w:before="100" w:beforeAutospacing="1" w:after="100" w:afterAutospacing="1" w:line="240" w:lineRule="auto"/>
+        <w:outlineLvl w:val="0"/>
+        <w:rPr>
+          <w:rFonts w:eastAsia="Times New Roman" w:cs="Times New Roman"/>
           <w:b/>
           <w:bCs/>
           <w:kern w:val="36"/>
           <w:sz w:val="48"/>
           <w:szCs w:val="48"/>
         </w:rPr>
-        <w:t>🧒</w:t>
-      </w:r>
-      <w:r>
-        <w:rPr>
-          <w:rFonts w:eastAsia="Times New Roman" w:cs="Times New Roman"/>
+      </w:pPr>
+      <w:r>
+        <w:rPr>
+          <w:rFonts w:ascii="Cambria" w:eastAsia="Times New Roman" w:hAnsi="Cambria" w:cs="Cambria"/>
           <w:b/>
           <w:bCs/>
           <w:kern w:val="36"/>
           <w:sz w:val="48"/>
           <w:szCs w:val="48"/>
         </w:rPr>
+        <w:t>🧒</w:t>
+      </w:r>
+      <w:r>
+        <w:rPr>
+          <w:rFonts w:eastAsia="Times New Roman" w:cs="Times New Roman"/>
+          <w:b/>
+          <w:bCs/>
+          <w:kern w:val="36"/>
+          <w:sz w:val="48"/>
+          <w:szCs w:val="48"/>
+        </w:rPr>
         <w:t xml:space="preserve"> MẪU GIÁO</w:t>
       </w:r>
+    </w:p>
+    <w:p>
+      <w:pPr>
+        <w:spacing w:before="100" w:beforeAutospacing="1" w:after="100" w:afterAutospacing="1" w:line="240" w:lineRule="auto"/>
+        <w:outlineLvl w:val="0"/>
+        <w:rPr>
+          <w:rFonts w:eastAsia="Times New Roman" w:cs="Times New Roman"/>
+          <w:b/>
+          <w:bCs/>
+          <w:kern w:val="36"/>
+          <w:sz w:val="48"/>
+          <w:szCs w:val="48"/>
+        </w:rPr>
+      </w:pPr>
     </w:p>
     <w:p>
       <w:pPr>
@@ -666,6 +727,7 @@
           <w:sz w:val="27"/>
           <w:szCs w:val="27"/>
         </w:rPr>
+        <w:lastRenderedPageBreak/>
         <w:t>Thứ 3</w:t>
       </w:r>
     </w:p>
@@ -864,7 +926,6 @@
           <w:sz w:val="24"/>
           <w:szCs w:val="24"/>
         </w:rPr>
-        <w:lastRenderedPageBreak/>
         <w:t>Bữa chính:</w:t>
       </w:r>
       <w:r>
@@ -1604,6 +1665,7 @@
           <w:sz w:val="24"/>
           <w:szCs w:val="24"/>
         </w:rPr>
+        <w:lastRenderedPageBreak/>
         <w:t>Bữa chính trưa:</w:t>
       </w:r>
       <w:r>
@@ -1776,7 +1838,6 @@
           <w:sz w:val="24"/>
           <w:szCs w:val="24"/>
         </w:rPr>
-        <w:lastRenderedPageBreak/>
         <w:t>Bữa chính trưa:</w:t>
       </w:r>
       <w:r>
@@ -2327,10 +2388,6 @@
         </w:rPr>
         <w:t xml:space="preserve"> Cháo thịt băm + bánh ngọt</w:t>
       </w:r>
-    </w:p>
-    <w:p>
-      <w:bookmarkStart w:id="0" w:name="_GoBack"/>
-      <w:bookmarkEnd w:id="0"/>
     </w:p>
     <w:sectPr>
       <w:pgSz w:w="11909" w:h="16834" w:code="9"/>
@@ -6545,6 +6602,17 @@
       <w:szCs w:val="24"/>
     </w:rPr>
   </w:style>
+  <w:style w:type="paragraph" w:styleId="ListParagraph">
+    <w:name w:val="List Paragraph"/>
+    <w:basedOn w:val="Normal"/>
+    <w:uiPriority w:val="34"/>
+    <w:qFormat/>
+    <w:rsid w:val="00A90C34"/>
+    <w:pPr>
+      <w:ind w:left="720"/>
+      <w:contextualSpacing/>
+    </w:pPr>
+  </w:style>
 </w:styles>
 </file>
 

</xml_diff>